<commit_message>
Documentar decisión de hub/dock Hiksemi DS11 en Equipo_actualizado.docx
- La fila "Sistema de control" ahora documenta el equipo real elegido:
  2x Hiksemi HS-HUB-DS11, alimentados por su entrada PD (no
  bus-powered), aclarando que no duplica el consumo ya contabilizado
  de las cámaras/dongle/CAN en sus propias filas.
- No se modifica la cifra de 30 W: el consumo propio del hub (~2-5W
  c/u, no publicado por Hiksemi) cabe dentro del margen ya estimado.
- Se agrega nota de "Decisión tomada" en las recomendaciones con la
  distribución sugerida entre los dos hubs (uno para cámaras USB3,
  otro para dispositivos USB2 de baja banda).

Co-Authored-By: Claude Sonnet 5 <noreply@anthropic.com>
</commit_message>
<xml_diff>
--- a/Equipo_actualizado.docx
+++ b/Equipo_actualizado.docx
@@ -925,7 +925,7 @@
               <w:jc w:val="left"/>
             </w:pPr>
             <w:r>
-              <w:t xml:space="preserve">Estimado. El repositorio pika_ros solo documenta el adaptador USB–CAN (gs_usb) dentro de este grupo: ~1–2.5 W, bus-powered vía USB. El resto (switches, MCU, Ethernet, hubs) no está documentado ni en pika_ros ni en las fuentes oficiales de AgileX. Ver recomendaciones de dimensionamiento en las notas generales, abajo.</w:t>
+              <w:t xml:space="preserve">Estimado. El repositorio pika_ros solo documenta el adaptador USB–CAN (gs_usb) dentro de este grupo: ~1–2.5 W, bus-powered vía USB. El resto (switches, MCU, Ethernet, hubs) no está documentado ni en pika_ros ni en las fuentes oficiales de AgileX. Equipo real decidido: 2× hub/dock Hiksemi HS-HUB-DS11, alimentados por su entrada PD (no bus-powered desde el laptop). El consumo de las cámaras D405/D435i, dongle del tracker y adaptador CAN ya está contabilizado en sus propias filas — no se duplica aquí. Lo único nuevo es el consumo propio de la electrónica interna de cada hub (no publicado por Hiksemi; estimado en ~2–5 W por unidad en reposo), que cabe dentro del margen de los 30 W ya estimados en esta fila; no se sube la cifra numérica. Ver recomendaciones de dimensionamiento en las notas generales, abajo.</w:t>
             </w:r>
           </w:p>
         </w:tc>
@@ -1799,6 +1799,24 @@
     <w:p>
       <w:pPr>
         <w:pStyle w:val="FirstParagraph"/>
+      </w:pPr>
+      <w:r>
+        <w:rPr>
+          <w:bCs/>
+          <w:b/>
+        </w:rPr>
+        <w:t xml:space="preserve">Decisión tomada (actualización):</w:t>
+      </w:r>
+      <w:r>
+        <w:t xml:space="preserve"> </w:t>
+      </w:r>
+      <w:r>
+        <w:t xml:space="preserve">se optó por 2× hub/dock Hiksemi HS-HUB-DS11 (2× USB 3.0 + 2× USB 2.0 cada uno, entrada PD hasta 100 W), alimentados por su entrada PD en vez de bus-powered desde el laptop, para garantizar presupuesto de energía estable a las cámaras D405/D435i. Distribución recomendada: un hub dedicado a las dos cámaras D405 (usa sus 2 puertos USB 3.0 al tope), el otro dedicado a dongle del tracker + fisheye/serial + adaptador CAN (todo cabe en USB 2.0, dejando sus puertos USB 3.0 libres para un segundo kit futuro). Para un uso más allá de un kit, un hub USB 3.0 alimentado dedicado (sin HDMI/VGA/RJ45 que no se usan aquí) daría más puertos por el mismo costo.</w:t>
+      </w:r>
+    </w:p>
+    <w:p>
+      <w:pPr>
+        <w:pStyle w:val="BodyText"/>
       </w:pPr>
       <w:r>
         <w:rPr>

</xml_diff>

<commit_message>
Corregir citas de fuentes en Equipo_actualizado.docx a AgileX directamente
- Elimina todas las referencias al repositorio pika_ros/Ivan1721 y a
  Consumo_Energia.md como fuente; ahora se cita directamente el portal
  oficial de documentación técnica de AgileX en Yuque
  (https://agilexsupport.yuque.com/staff-hso6mo/peoot3/rcrola7ogxquhivi)
  de donde provienen los .md del repositorio, y el manual oficial del
  Piper (agilex-piper-user-manual.pdf).
- Elimina las menciones a "documento original" / Equipo.docx: este
  archivo pasa a ser el documento de referencia en adelante.
- El detalle del límite de corriente del motor del gripper (1000 mA)
  ahora se atribuye al driver oficial de AgileX en vez de "el
  repositorio pika_ros".

Co-Authored-By: Claude Sonnet 5 <noreply@anthropic.com>
</commit_message>
<xml_diff>
--- a/Equipo_actualizado.docx
+++ b/Equipo_actualizado.docx
@@ -19,60 +19,7 @@
           <w:iCs/>
           <w:i/>
         </w:rPr>
-        <w:t xml:space="preserve">Tabla base: documento original</w:t>
-      </w:r>
-      <w:r>
-        <w:rPr>
-          <w:iCs/>
-          <w:i/>
-        </w:rPr>
-        <w:t xml:space="preserve"> </w:t>
-      </w:r>
-      <w:r>
-        <w:rPr>
-          <w:bCs/>
-          <w:b/>
-          <w:iCs/>
-          <w:i/>
-        </w:rPr>
-        <w:t xml:space="preserve">Equipo.docx</w:t>
-      </w:r>
-      <w:r>
-        <w:rPr>
-          <w:iCs/>
-          <w:i/>
-        </w:rPr>
-        <w:t xml:space="preserve"> </w:t>
-      </w:r>
-      <w:r>
-        <w:rPr>
-          <w:iCs/>
-          <w:i/>
-        </w:rPr>
-        <w:t xml:space="preserve">(mismo repositorio), con observaciones agregadas a partir de las fuentes oficiales de AgileX incluidas en el repositorio</w:t>
-      </w:r>
-      <w:r>
-        <w:rPr>
-          <w:iCs/>
-          <w:i/>
-        </w:rPr>
-        <w:t xml:space="preserve"> </w:t>
-      </w:r>
-      <w:r>
-        <w:rPr>
-          <w:bCs/>
-          <w:b/>
-          <w:iCs/>
-          <w:i/>
-        </w:rPr>
-        <w:t xml:space="preserve">Ivan1721/pika_ros (rama pika-custom-ros2)</w:t>
-      </w:r>
-      <w:r>
-        <w:rPr>
-          <w:iCs/>
-          <w:i/>
-        </w:rPr>
-        <w:t xml:space="preserve">: la hoja de datos del producto Pika (</w:t>
+        <w:t xml:space="preserve">Inventario de consumo energético del equipo Pika/Piper. Las observaciones incorporan información de las fuentes oficiales de AgileX: el portal de documentación técnica de Pika en Yuque (https://agilexsupport.yuque.com/staff-hso6mo/peoot3/rcrola7ogxquhivi — incluye la hoja de datos del producto Pika y la guía de calibración/instalación de Tracker y Sense) y el manual oficial del brazo Piper (</w:t>
       </w:r>
       <w:r>
         <w:rPr>
@@ -80,58 +27,14 @@
           <w:iCs/>
           <w:i/>
         </w:rPr>
-        <w:t xml:space="preserve">[Externo] Hoja de datos del producto Pika beta (CN).md</w:t>
+        <w:t xml:space="preserve">agilex-piper-user-manual.pdf</w:t>
       </w:r>
       <w:r>
         <w:rPr>
           <w:iCs/>
           <w:i/>
         </w:rPr>
-        <w:t xml:space="preserve">) y el manual oficial del brazo Piper (</w:t>
-      </w:r>
-      <w:r>
-        <w:rPr>
-          <w:rStyle w:val="VerbatimChar"/>
-          <w:iCs/>
-          <w:i/>
-        </w:rPr>
-        <w:t xml:space="preserve">agilex-piper-user-manual.pdf</w:t>
-      </w:r>
-      <w:r>
-        <w:rPr>
-          <w:iCs/>
-          <w:i/>
-        </w:rPr>
-        <w:t xml:space="preserve">). El archivo</w:t>
-      </w:r>
-      <w:r>
-        <w:rPr>
-          <w:iCs/>
-          <w:i/>
-        </w:rPr>
-        <w:t xml:space="preserve"> </w:t>
-      </w:r>
-      <w:r>
-        <w:rPr>
-          <w:rStyle w:val="VerbatimChar"/>
-          <w:iCs/>
-          <w:i/>
-        </w:rPr>
-        <w:t xml:space="preserve">Consumo_Energia.md</w:t>
-      </w:r>
-      <w:r>
-        <w:rPr>
-          <w:iCs/>
-          <w:i/>
-        </w:rPr>
-        <w:t xml:space="preserve"> </w:t>
-      </w:r>
-      <w:r>
-        <w:rPr>
-          <w:iCs/>
-          <w:i/>
-        </w:rPr>
-        <w:t xml:space="preserve">del mismo repositorio es un documento intermedio que compila esas mismas fuentes oficiales, no una fuente primaria en sí. Los valores numéricos originales de esta tabla no se modifican; solo se añaden aclaraciones en la columna de Observaciones. Las filas de Intel NUC y Cargador de baterías Drone se dejan exactamente como en el documento original, sin observaciones adicionales.</w:t>
+        <w:t xml:space="preserve">, AgileX). Los valores de Cantidad, Alimentación, Potencia y Energía reflejan mediciones/estimaciones propias de cada equipo; las observaciones solo aclaran o amplían con la fuente oficial correspondiente cuando aplica. Las filas de Intel NUC y Cargador de baterías Drone no tienen observaciones adicionales, al ser hardware fuera del ecosistema Pika/Piper.</w:t>
       </w:r>
     </w:p>
     <w:tbl>
@@ -415,7 +318,7 @@
               <w:jc w:val="left"/>
             </w:pPr>
             <w:r>
-              <w:t xml:space="preserve">Estimado, depende de la configuración de investigación. La hoja de datos oficial de Pika especifica un conector XT30 de 24 V DC para el motor de la pinza; el firmware de pika_ros (parámetro motor_current_limit, en el código fuente del repositorio) limita la corriente del motor a 1000 mA @ 24 V = 24 W pico (por debajo del valor de 30 W usado aquí). En reposo/sujeción el consumo real es mucho menor (~2–7 W). Los sensores (cámara D405 + fisheye + IMU) se alimentan vía Type-C, independientemente de esta línea de 24 V.</w:t>
+              <w:t xml:space="preserve">Estimado, depende de la configuración de investigación. La hoja de datos oficial de Pika especifica un conector XT30 de 24 V DC para el motor de la pinza; el driver oficial de AgileX para Pika Gripper limita por defecto la corriente del motor a 1000 mA @ 24 V = 24 W pico (por debajo del valor de 30 W usado aquí). En reposo/sujeción el consumo real es mucho menor (~2–7 W). Los sensores (cámara D405 + fisheye + IMU) se alimentan vía Type-C, independientemente de esta línea de 24 V.</w:t>
             </w:r>
           </w:p>
         </w:tc>
@@ -655,7 +558,7 @@
               <w:jc w:val="left"/>
             </w:pPr>
             <w:r>
-              <w:t xml:space="preserve">Fila nueva (no está en el documento original). Cifra oficial de la hoja de datos de Pika: 12 V, 3 W típico, batería 10 Ah, 30 h de autonomía. Cantidad asumida en 2 (una por puesto de operación); ajustar si el equipo real usa otra cantidad de base stations.</w:t>
+              <w:t xml:space="preserve">Cifra oficial de la hoja de datos de Pika: 12 V, 3 W típico, batería 10 Ah, 30 h de autonomía. Cantidad asumida en 2 (una por puesto de operación); ajustar si el equipo real usa otra cantidad de base stations.</w:t>
             </w:r>
           </w:p>
         </w:tc>
@@ -745,7 +648,7 @@
               <w:jc w:val="left"/>
             </w:pPr>
             <w:r>
-              <w:t xml:space="preserve">Fila nueva (no está en el documento original). Autonomía oficial de 9 h según la hoja de datos de Pika; la cifra en W es una estimación (AgileX no publica la capacidad de la batería), inferida a partir de trackers ópticos similares. Cantidad asumida en 2 (un tracker por brazo/Sense).</w:t>
+              <w:t xml:space="preserve">Autonomía oficial de 9 h según la hoja de datos de Pika; la cifra en W es una estimación (AgileX no publica la capacidad de la batería), inferida a partir de trackers ópticos similares. Cantidad asumida en 2 (un tracker por brazo/Sense).</w:t>
             </w:r>
           </w:p>
         </w:tc>
@@ -925,7 +828,7 @@
               <w:jc w:val="left"/>
             </w:pPr>
             <w:r>
-              <w:t xml:space="preserve">Estimado. El repositorio pika_ros solo documenta el adaptador USB–CAN (gs_usb) dentro de este grupo: ~1–2.5 W, bus-powered vía USB. El resto (switches, MCU, Ethernet, hubs) no está documentado ni en pika_ros ni en las fuentes oficiales de AgileX. Equipo real decidido: 2× hub/dock Hiksemi HS-HUB-DS11, alimentados por su entrada PD (no bus-powered desde el laptop). El consumo de las cámaras D405/D435i, dongle del tracker y adaptador CAN ya está contabilizado en sus propias filas — no se duplica aquí. Lo único nuevo es el consumo propio de la electrónica interna de cada hub (no publicado por Hiksemi; estimado en ~2–5 W por unidad en reposo), que cabe dentro del margen de los 30 W ya estimados en esta fila; no se sube la cifra numérica. Ver recomendaciones de dimensionamiento en las notas generales, abajo.</w:t>
+              <w:t xml:space="preserve">Estimado. El adaptador USB–CAN (gs_usb) usado para los brazos Piper es bus-powered, con consumo estimado de ~1–2.5 W. El resto (switches, MCU, Ethernet, hubs) no está cubierto por ninguna fuente oficial de AgileX. Equipo real decidido: 2× hub/dock Hiksemi HS-HUB-DS11, alimentados por su entrada PD (no bus-powered desde el laptop). El consumo de las cámaras D405/D435i, dongle del tracker y adaptador CAN ya está contabilizado en sus propias filas — no se duplica aquí. Lo único nuevo es el consumo propio de la electrónica interna de cada hub (no publicado por Hiksemi; estimado en ~2–5 W por unidad en reposo), que cabe dentro del margen de los 30 W ya estimados en esta fila; no se sube la cifra numérica. Ver recomendaciones de dimensionamiento en las notas generales, abajo.</w:t>
             </w:r>
           </w:p>
         </w:tc>
@@ -1169,7 +1072,7 @@
               <w:t xml:space="preserve"> </w:t>
             </w:r>
             <w:r>
-              <w:t xml:space="preserve">de todas las filas anteriores (incluye las dos filas nuevas de Pika Station y Tracker).</w:t>
+              <w:t xml:space="preserve">de todas las filas anteriores.</w:t>
             </w:r>
           </w:p>
         </w:tc>
@@ -1196,7 +1099,7 @@
         <w:pStyle w:val="Compact"/>
       </w:pPr>
       <w:r>
-        <w:t xml:space="preserve">Los valores del documento original (Cantidad, Alimentación, Potencia unitaria/total, Horas/día, Energía)</w:t>
+        <w:t xml:space="preserve">Las filas</w:t>
       </w:r>
       <w:r>
         <w:t xml:space="preserve"> </w:t>
@@ -1206,13 +1109,29 @@
           <w:bCs/>
           <w:b/>
         </w:rPr>
-        <w:t xml:space="preserve">no se modificaron</w:t>
+        <w:t xml:space="preserve">Intel NUC</w:t>
       </w:r>
       <w:r>
         <w:t xml:space="preserve"> </w:t>
       </w:r>
       <w:r>
-        <w:t xml:space="preserve">para ninguna fila preexistente; solo se agregó texto a la columna Observaciones donde las fuentes oficiales de AgileX aportan información adicional.</w:t>
+        <w:t xml:space="preserve">y</w:t>
+      </w:r>
+      <w:r>
+        <w:t xml:space="preserve"> </w:t>
+      </w:r>
+      <w:r>
+        <w:rPr>
+          <w:bCs/>
+          <w:b/>
+        </w:rPr>
+        <w:t xml:space="preserve">Cargador baterías Drone</w:t>
+      </w:r>
+      <w:r>
+        <w:t xml:space="preserve"> </w:t>
+      </w:r>
+      <w:r>
+        <w:t xml:space="preserve">no tienen observaciones adicionales — ninguna fuente oficial de AgileX cubre estos dos equipos.</w:t>
       </w:r>
     </w:p>
     <w:p>
@@ -1224,7 +1143,7 @@
         <w:pStyle w:val="Compact"/>
       </w:pPr>
       <w:r>
-        <w:t xml:space="preserve">Las filas</w:t>
+        <w:t xml:space="preserve">Se incluyen</w:t>
       </w:r>
       <w:r>
         <w:t xml:space="preserve"> </w:t>
@@ -1234,7 +1153,7 @@
           <w:bCs/>
           <w:b/>
         </w:rPr>
-        <w:t xml:space="preserve">Intel NUC</w:t>
+        <w:t xml:space="preserve">Pika Station</w:t>
       </w:r>
       <w:r>
         <w:t xml:space="preserve"> </w:t>
@@ -1250,38 +1169,10 @@
           <w:bCs/>
           <w:b/>
         </w:rPr>
-        <w:t xml:space="preserve">Cargador baterías Drone</w:t>
-      </w:r>
-      <w:r>
-        <w:t xml:space="preserve"> </w:t>
-      </w:r>
-      <w:r>
-        <w:t xml:space="preserve">se dejaron</w:t>
-      </w:r>
-      <w:r>
-        <w:t xml:space="preserve"> </w:t>
-      </w:r>
-      <w:r>
-        <w:rPr>
-          <w:bCs/>
-          <w:b/>
-        </w:rPr>
-        <w:t xml:space="preserve">idénticas</w:t>
-      </w:r>
-      <w:r>
-        <w:t xml:space="preserve"> </w:t>
-      </w:r>
-      <w:r>
-        <w:t xml:space="preserve">al documento original (</w:t>
-      </w:r>
-      <w:r>
-        <w:rPr>
-          <w:rStyle w:val="VerbatimChar"/>
-        </w:rPr>
-        <w:t xml:space="preserve">Equipo.docx</w:t>
-      </w:r>
-      <w:r>
-        <w:t xml:space="preserve">), sin observaciones añadidas — ninguna fuente oficial de AgileX cubre estos dos equipos.</w:t>
+        <w:t xml:space="preserve">Tracker de posicionamiento</w:t>
+      </w:r>
+      <w:r>
+        <w:t xml:space="preserve">, con datos tomados directamente de la hoja de datos oficial de Pika (portal de documentación técnica de AgileX en Yuque).</w:t>
       </w:r>
     </w:p>
     <w:p>
@@ -1293,18 +1184,6 @@
         <w:pStyle w:val="Compact"/>
       </w:pPr>
       <w:r>
-        <w:t xml:space="preserve">Se agregaron dos filas nuevas (Pika Station y Tracker de posicionamiento) que no estaban en el documento original, con datos tomados directamente de la hoja de datos oficial de Pika.</w:t>
-      </w:r>
-    </w:p>
-    <w:p>
-      <w:pPr>
-        <w:numPr>
-          <w:ilvl w:val="0"/>
-          <w:numId w:val="1001"/>
-        </w:numPr>
-        <w:pStyle w:val="Compact"/>
-      </w:pPr>
-      <w:r>
         <w:t xml:space="preserve">Se conserva el modelo</w:t>
       </w:r>
       <w:r>
@@ -1321,40 +1200,7 @@
         <w:t xml:space="preserve"> </w:t>
       </w:r>
       <w:r>
-        <w:t xml:space="preserve">tal como en el original: son cámaras distintas de las D405 incluidas en el kit Pika, no una corrección de nombre.</w:t>
-      </w:r>
-    </w:p>
-    <w:p>
-      <w:pPr>
-        <w:numPr>
-          <w:ilvl w:val="0"/>
-          <w:numId w:val="1001"/>
-        </w:numPr>
-        <w:pStyle w:val="Compact"/>
-      </w:pPr>
-      <w:r>
-        <w:rPr>
-          <w:rStyle w:val="VerbatimChar"/>
-        </w:rPr>
-        <w:t xml:space="preserve">Consumo_Energia.md</w:t>
-      </w:r>
-      <w:r>
-        <w:t xml:space="preserve"> </w:t>
-      </w:r>
-      <w:r>
-        <w:t xml:space="preserve">(repositorio</w:t>
-      </w:r>
-      <w:r>
-        <w:t xml:space="preserve"> </w:t>
-      </w:r>
-      <w:r>
-        <w:rPr>
-          <w:rStyle w:val="VerbatimChar"/>
-        </w:rPr>
-        <w:t xml:space="preserve">pika_ros</w:t>
-      </w:r>
-      <w:r>
-        <w:t xml:space="preserve">) es un documento de compilación/resumen, no una fuente primaria; las observaciones de esta tabla citan las fuentes oficiales de AgileX directamente.</w:t>
+        <w:t xml:space="preserve">tal como está: son cámaras distintas de las D405 incluidas en el kit Pika, no una corrección de nombre.</w:t>
       </w:r>
     </w:p>
     <w:p>
@@ -1602,37 +1448,7 @@
         <w:t xml:space="preserve"> </w:t>
       </w:r>
       <w:r>
-        <w:t xml:space="preserve">(ya parcialmente implementado con</w:t>
-      </w:r>
-      <w:r>
-        <w:t xml:space="preserve"> </w:t>
-      </w:r>
-      <w:r>
-        <w:rPr>
-          <w:rStyle w:val="VerbatimChar"/>
-        </w:rPr>
-        <w:t xml:space="preserve">setup_device.py</w:t>
-      </w:r>
-      <w:r>
-        <w:t xml:space="preserve"> </w:t>
-      </w:r>
-      <w:r>
-        <w:t xml:space="preserve">y</w:t>
-      </w:r>
-      <w:r>
-        <w:t xml:space="preserve"> </w:t>
-      </w:r>
-      <w:r>
-        <w:rPr>
-          <w:rStyle w:val="VerbatimChar"/>
-        </w:rPr>
-        <w:t xml:space="preserve">81-vive.rules</w:t>
-      </w:r>
-      <w:r>
-        <w:t xml:space="preserve"> </w:t>
-      </w:r>
-      <w:r>
-        <w:t xml:space="preserve">en este repositorio): mantener rutas estables (</w:t>
+        <w:t xml:space="preserve">(el driver oficial de AgileX para Pika incluye herramientas para esto): mantener rutas estables (</w:t>
       </w:r>
       <w:r>
         <w:rPr>
@@ -1675,19 +1491,7 @@
         <w:t xml:space="preserve"> </w:t>
       </w:r>
       <w:r>
-        <w:t xml:space="preserve">de cada puerto del hub. Ya se vivió este problema con</w:t>
-      </w:r>
-      <w:r>
-        <w:t xml:space="preserve"> </w:t>
-      </w:r>
-      <w:r>
-        <w:rPr>
-          <w:rStyle w:val="VerbatimChar"/>
-        </w:rPr>
-        <w:t xml:space="preserve">can_config.sh</w:t>
-      </w:r>
-      <w:r>
-        <w:t xml:space="preserve">, que usa direcciones USB físicas hardcodeadas (</w:t>
+        <w:t xml:space="preserve">de cada puerto del hub. El script de configuración CAN del brazo Piper usa direcciones USB físicas hardcodeadas (</w:t>
       </w:r>
       <w:r>
         <w:rPr>
@@ -1823,14 +1627,7 @@
           <w:iCs/>
           <w:i/>
         </w:rPr>
-        <w:t xml:space="preserve">Fuentes oficiales:</w:t>
-      </w:r>
-      <w:r>
-        <w:rPr>
-          <w:iCs/>
-          <w:i/>
-        </w:rPr>
-        <w:t xml:space="preserve"> </w:t>
+        <w:t xml:space="preserve">Fuentes oficiales: portal de documentación técnica de AgileX para Pika en Yuque (https://agilexsupport.yuque.com/staff-hso6mo/peoot3/rcrola7ogxquhivi) y el manual oficial del brazo Piper (</w:t>
       </w:r>
       <w:r>
         <w:rPr>
@@ -1838,123 +1635,14 @@
           <w:iCs/>
           <w:i/>
         </w:rPr>
-        <w:t xml:space="preserve">[Externo] Hoja de datos del producto Pika beta (CN).md</w:t>
+        <w:t xml:space="preserve">agilex-piper-user-manual.pdf</w:t>
       </w:r>
       <w:r>
         <w:rPr>
           <w:iCs/>
           <w:i/>
         </w:rPr>
-        <w:t xml:space="preserve"> </w:t>
-      </w:r>
-      <w:r>
-        <w:rPr>
-          <w:iCs/>
-          <w:i/>
-        </w:rPr>
-        <w:t xml:space="preserve">(datasheet Pika, AgileX) y</w:t>
-      </w:r>
-      <w:r>
-        <w:rPr>
-          <w:iCs/>
-          <w:i/>
-        </w:rPr>
-        <w:t xml:space="preserve"> </w:t>
-      </w:r>
-      <w:r>
-        <w:rPr>
-          <w:rStyle w:val="VerbatimChar"/>
-          <w:iCs/>
-          <w:i/>
-        </w:rPr>
-        <w:t xml:space="preserve">agilex-piper-user-manual.pdf</w:t>
-      </w:r>
-      <w:r>
-        <w:rPr>
-          <w:iCs/>
-          <w:i/>
-        </w:rPr>
-        <w:t xml:space="preserve"> </w:t>
-      </w:r>
-      <w:r>
-        <w:rPr>
-          <w:iCs/>
-          <w:i/>
-        </w:rPr>
-        <w:t xml:space="preserve">(manual Piper, AgileX), ambos incluidos en el repositorio</w:t>
-      </w:r>
-      <w:r>
-        <w:rPr>
-          <w:iCs/>
-          <w:i/>
-        </w:rPr>
-        <w:t xml:space="preserve"> </w:t>
-      </w:r>
-      <w:r>
-        <w:rPr>
-          <w:rStyle w:val="VerbatimChar"/>
-          <w:iCs/>
-          <w:i/>
-        </w:rPr>
-        <w:t xml:space="preserve">Ivan1721/pika_ros</w:t>
-      </w:r>
-      <w:r>
-        <w:rPr>
-          <w:iCs/>
-          <w:i/>
-        </w:rPr>
-        <w:t xml:space="preserve">, rama</w:t>
-      </w:r>
-      <w:r>
-        <w:rPr>
-          <w:iCs/>
-          <w:i/>
-        </w:rPr>
-        <w:t xml:space="preserve"> </w:t>
-      </w:r>
-      <w:r>
-        <w:rPr>
-          <w:rStyle w:val="VerbatimChar"/>
-          <w:iCs/>
-          <w:i/>
-        </w:rPr>
-        <w:t xml:space="preserve">pika-custom-ros2</w:t>
-      </w:r>
-      <w:r>
-        <w:rPr>
-          <w:iCs/>
-          <w:i/>
-        </w:rPr>
-        <w:t xml:space="preserve">.</w:t>
-      </w:r>
-      <w:r>
-        <w:rPr>
-          <w:iCs/>
-          <w:i/>
-        </w:rPr>
-        <w:t xml:space="preserve"> </w:t>
-      </w:r>
-      <w:r>
-        <w:rPr>
-          <w:rStyle w:val="VerbatimChar"/>
-          <w:iCs/>
-          <w:i/>
-        </w:rPr>
-        <w:t xml:space="preserve">Consumo_Energia.md</w:t>
-      </w:r>
-      <w:r>
-        <w:rPr>
-          <w:iCs/>
-          <w:i/>
-        </w:rPr>
-        <w:t xml:space="preserve"> </w:t>
-      </w:r>
-      <w:r>
-        <w:rPr>
-          <w:iCs/>
-          <w:i/>
-        </w:rPr>
-        <w:t xml:space="preserve">(mismo repositorio) es la compilación intermedia de estas fuentes.</w:t>
+        <w:t xml:space="preserve">, AgileX).</w:t>
       </w:r>
     </w:p>
     <w:sectPr/>

</xml_diff>